<commit_message>
Resume: headline names all three lanes (HR and benefits technology, AI enablement, process improvement)
Rebuilt from the career repo master (master_2026-10-19.md, 2026-10-26 headline change), phone
left off as before.

Co-Authored-By: Claude Opus 5.5 <noreply@anthropic.com>
Claude-Session: https://claude.ai/code/session_01FsLzaePiffFTcBmYZDmdLa
</commit_message>
<xml_diff>
--- a/Wes_Shelton_Resume.docx
+++ b/Wes_Shelton_Resume.docx
@@ -59,7 +59,7 @@
           <w:i w:val="0"/>
           <w:sz w:val="23"/>
         </w:rPr>
-        <w:t>AI ENABLEMENT AND ADOPTION | BUSINESS PROCESS IMPROVEMENT</w:t>
+        <w:t>HR AND BENEFITS TECHNOLOGY | AI ENABLEMENT | PROCESS IMPROVEMENT</w:t>
       </w:r>
     </w:p>
     <w:p>
@@ -74,7 +74,7 @@
           <w:i/>
           <w:sz w:val="20"/>
         </w:rPr>
-        <w:t>Copilot Studio and Power Platform • Training and Adoption Programs • Governed AI Prompt Libraries</w:t>
+        <w:t>ADP Workforce Now, Workday, PeopleSoft • Copilot Studio and Power Platform • Training and Adoption Programs</w:t>
       </w:r>
     </w:p>
     <w:p>

</xml_diff>